<commit_message>
Fix report claims, move data to data/, keep single report
- report.docx / make_report_docx.py: correct WAPE reduction (62% non-outlier,
  49% all rows), December market_index/quote_signal row counts, CV window
  description, random K-fold rationale, NaN-handling and categorical-encoding
  wording; add weight-ceiling validation count and weekday pattern
- Move CSV inputs into data/ with the task PDF's file names; update paths in
  src/train.py and README
- Remove stale report.pdf, report_layout_check.pdf and generate_report.py
</commit_message>
<xml_diff>
--- a/report.docx
+++ b/report.docx
@@ -64,7 +64,7 @@
           <w:color w:val="444444"/>
           <w:sz w:val="20"/>
         </w:rPr>
-        <w:t>The goal is to predict posted_rate (freight load price in USD) for 12,000 unseen loads covering November–December 2025, using 48,000 labeled loads (January–October 2025) for training. The model is a gradient-boosted tree (sklearn HistGradientBoostingRegressor) that learns log(rate-per-mile); the dollar prediction is recovered as exp(output) × distance. Cross-validation uses three rolling-origin (expanding-window) folds, matching the temporal structure of the holdout set. The best model achieves an average non-outlier WAPE of 3.34% versus 10.74% for the naive median-rate-per-mile baseline — a 68% reduction in weighted absolute error.</w:t>
+        <w:t>The goal is to predict posted_rate (freight load price in USD) for 12,000 unseen loads covering November–December 2025, using 48,000 labeled loads (January–October 2025) for training. The model is a gradient-boosted tree (sklearn HistGradientBoostingRegressor) that learns log(rate-per-mile); the dollar prediction is recovered as exp(output) × distance. Cross-validation uses three rolling-origin (expanding-window) folds, matching the temporal structure of the holdout set. The best model achieves an average non-outlier WAPE of 3.34% versus 8.76% for the naive median-rate-per-mile baseline on the same rows (a 62% reduction in weighted absolute error); including the outlier rows the figures are 5.47% versus 10.74% (a 49% reduction).</w:t>
       </w:r>
     </w:p>
     <w:p>
@@ -92,7 +92,7 @@
           <w:color w:val="444444"/>
           <w:sz w:val="20"/>
         </w:rPr>
-        <w:t>train-test.csv contains 48,000 rows (Jan–Oct 2025, 14 columns). validation.csv contains 12,000 rows (Nov–Dec 2025, 13 columns — no posted_rate). The following issues were identified and treated before feature engineering:</w:t>
+        <w:t>data/train_test.csv contains 48,000 rows (Jan–Oct 2025, 14 columns). data/validation.csv contains 12,000 rows (Nov–Dec 2025, 13 columns — no posted_rate). The following issues were identified and treated before feature engineering:</w:t>
       </w:r>
     </w:p>
     <w:tbl>
@@ -333,7 +333,7 @@
                 <w:b w:val="0"/>
                 <w:sz w:val="17"/>
               </w:rPr>
-              <w:t>1,191 train  /  —</w:t>
+              <w:t>1,191 train  /  297 val</w:t>
             </w:r>
           </w:p>
         </w:tc>
@@ -663,7 +663,7 @@
                 <w:b w:val="0"/>
                 <w:sz w:val="17"/>
               </w:rPr>
-              <w:t>OOV '__unknown__' bucket in label encoder; lat/lon features unaffected</w:t>
+              <w:t>Mapped to an '__unknown__' code (never seen in training, so not learned); lat/lon features still describe the city</w:t>
             </w:r>
           </w:p>
         </w:tc>
@@ -770,7 +770,7 @@
           <w:color w:val="444444"/>
           <w:sz w:val="20"/>
         </w:rPr>
-        <w:t>The validation set (Nov–Dec 2025) is strictly later than the training set (Jan–Oct 2025). Random K-fold would mix future labels into earlier training folds, artificially inflating performance estimates. It also exposes the model to seasonal patterns from Nov–Dec during tuning, making the evaluation overly optimistic for the real out-of-time holdout.</w:t>
+        <w:t>The validation set (Nov–Dec 2025) is strictly later than the training set (Jan–Oct 2025). Random K-fold would mix future labels into earlier training folds, artificially inflating performance estimates, and it would not mimic the real task of predicting a later period (Nov–Dec) from earlier data only.</w:t>
       </w:r>
     </w:p>
     <w:p>
@@ -792,7 +792,7 @@
           <w:color w:val="444444"/>
           <w:sz w:val="20"/>
         </w:rPr>
-        <w:t>Three forward-chaining folds were used. In each fold the training window expands by one month and the validation window advances by two months, mirroring production conditions.</w:t>
+        <w:t>Three forward-chaining folds were used. In each fold the training window expands by one month and the two-month validation window advances by one month (adjacent validation windows overlap by one month), mirroring production conditions.</w:t>
       </w:r>
     </w:p>
     <w:tbl>
@@ -1232,7 +1232,6 @@
       <w:pPr>
         <w:pStyle w:val="Heading1"/>
         <w:spacing w:before="200" w:after="60"/>
-        <w:pageBreakBefore w:val="1"/>
       </w:pPr>
       <w:r>
         <w:rPr>
@@ -1263,7 +1262,7 @@
           <w:color w:val="444444"/>
           <w:sz w:val="20"/>
         </w:rPr>
-        <w:t>Rate-per-mile (RPM = posted_rate / distance) is right-skewed and heteroscedastic. Modelling log(RPM) stabilises variance, ensures predictions are always positive, and respects the multiplicative relationship between price-per-mile and distance. Predictions are recovered as  exp(model output) × distance.</w:t>
+        <w:t>Rate-per-mile (RPM = posted_rate / distance) is strongly right-skewed (skewness 8.72 raw, −0.04 after the log). Modelling log(RPM) gives a near-symmetric target, ensures predictions are always positive, and respects the multiplicative relationship between price-per-mile and distance. Predictions are recovered as  exp(model output) × distance.</w:t>
       </w:r>
     </w:p>
     <w:p>
@@ -1285,7 +1284,7 @@
           <w:color w:val="444444"/>
           <w:sz w:val="20"/>
         </w:rPr>
-        <w:t>Gradient-boosted histogram trees handle the mixed feature space (numeric distances, categorical lanes, temporal day features) without one-hot explosion. The native NaN support is exploited for market_index before imputation verification. max_iter=500, learning_rate=0.05, max_depth=6, min_samples_leaf=20, l2_regularization=0.1, seed=42.</w:t>
+        <w:t>Gradient-boosted histogram trees handle the mixed feature space (numeric distances, temporal day features, and equipment, city and lane columns label-encoded as integers). Missing weight and market_index values are imputed before modelling, so the model never sees NaNs. max_iter=500, learning_rate=0.05, max_depth=6, min_samples_leaf=20, l2_regularization=0.1, seed=42.</w:t>
       </w:r>
     </w:p>
     <w:p>
@@ -3241,7 +3240,6 @@
       <w:pPr>
         <w:pStyle w:val="Heading1"/>
         <w:spacing w:before="200" w:after="60"/>
-        <w:pageBreakBefore w:val="1"/>
       </w:pPr>
       <w:r>
         <w:rPr>
@@ -3272,7 +3270,7 @@
           <w:color w:val="444444"/>
           <w:sz w:val="20"/>
         </w:rPr>
-        <w:t>The december-chart-inputs.csv file does not include these columns. Both are filled with their per-date median from validation.csv inputs for December 2025 (market_index median per day from ~380 non-missing December validation rows; quote_signal median per day from all 12,000 validation rows). Lexington coordinates (36.99152, −84.99876) and Fort Wayne coordinates (41.31561, −85.36206) are taken from train-test.csv. Predictions range $785.49–$803.38 (mean $795.59), showing a clear weekly cycle with mid-week peaks and weekend dips.</w:t>
+        <w:t>The data/december_chart_inputs.csv file does not include these columns. Both are filled with their per-date median from data/validation.csv inputs for December 2025 (market_index median per day from the 6,030 non-missing December validation rows; quote_signal median per day from all 6,164 December validation rows). Lexington coordinates (36.99152, −84.99876) and Fort Wayne coordinates (41.31561, −85.36206) are taken from data/train_test.csv. Predictions range $785.49–$803.38 (mean $795.59), a swing of about $18 (2%). The curve repeats weekly: the weekday means are highest on Thursday ($801.9) and lowest on Sunday ($789.8).</w:t>
       </w:r>
     </w:p>
     <w:p>

</xml_diff>

<commit_message>
Improve model with day-level market features, day index and recency weighting
- features: add day_mi_median, day_qs_median, quote_rel (inputs only) and
  day_index; 26 features in total
- train: recency-weighted fit (exp(-age/90 d)); December features use the
  validation inputs' real daily market medians
- ablation: add src/ablation.py and outputs/ablation_results.csv
- CV non-outlier WAPE 3.34% -> 2.66% (naive baseline 8.76%); better than the
  original model in all three folds
- regenerate validation_predictions.csv, December predictions, chart and
  report.docx (tables now read from result files)
- README: document new features, ablation and layout; drop unsupported
  "spec requirement" wording; add python-docx to requirements
</commit_message>
<xml_diff>
--- a/report.docx
+++ b/report.docx
@@ -64,7 +64,7 @@
           <w:color w:val="444444"/>
           <w:sz w:val="20"/>
         </w:rPr>
-        <w:t>The goal is to predict posted_rate (freight load price in USD) for 12,000 unseen loads covering November–December 2025, using 48,000 labeled loads (January–October 2025) for training. The model is a gradient-boosted tree (sklearn HistGradientBoostingRegressor) that learns log(rate-per-mile); the dollar prediction is recovered as exp(output) × distance. Cross-validation uses three rolling-origin (expanding-window) folds, matching the temporal structure of the holdout set. The best model achieves an average non-outlier WAPE of 3.34% versus 8.76% for the naive median-rate-per-mile baseline on the same rows (a 62% reduction in weighted absolute error); including the outlier rows the figures are 5.47% versus 10.74% (a 49% reduction).</w:t>
+        <w:t>The goal is to predict posted_rate (freight load price in USD) for 12,000 unseen loads covering November–December 2025, using 48,000 labeled loads (January–October 2025) for training. The model is a gradient-boosted tree (sklearn HistGradientBoostingRegressor) that learns log(rate-per-mile); the dollar prediction is recovered as exp(output) × distance. Cross-validation uses three rolling-origin (expanding-window) folds, matching the temporal structure of the holdout set. The best model achieves an average non-outlier WAPE of 2.66% versus 8.76% for the naive median-rate-per-mile baseline on the same rows (a 70% reduction in weighted absolute error); including the outlier rows the figures are 4.80% versus 10.74% (a 55% reduction). These are cross-validation figures on January–October only; the November–December validation labels are not available.</w:t>
       </w:r>
     </w:p>
     <w:p>
@@ -725,7 +725,7 @@
                 <w:b w:val="0"/>
                 <w:sz w:val="17"/>
               </w:rPr>
-              <w:t>Both distance and haversine_dist used as features; diff = routing detour proxy</w:t>
+              <w:t>Both distance and hav_dist used as features; diff = routing detour proxy</w:t>
             </w:r>
           </w:p>
         </w:tc>
@@ -1284,7 +1284,7 @@
           <w:color w:val="444444"/>
           <w:sz w:val="20"/>
         </w:rPr>
-        <w:t>Gradient-boosted histogram trees handle the mixed feature space (numeric distances, temporal day features, and equipment, city and lane columns label-encoded as integers). Missing weight and market_index values are imputed before modelling, so the model never sees NaNs. max_iter=500, learning_rate=0.05, max_depth=6, min_samples_leaf=20, l2_regularization=0.1, seed=42.</w:t>
+        <w:t>Gradient-boosted histogram trees handle the mixed feature space (numeric distances, temporal day features, and equipment, city and lane columns label-encoded as integers). Training rows are weighted by recency, exp(−age/90 days), so the model follows the latest market level. Missing weight and market_index values are imputed before modelling, so the model never sees NaNs. max_iter=500, learning_rate=0.05, max_depth=6, min_samples_leaf=20, l2_regularization=0.1, seed=42.</w:t>
       </w:r>
     </w:p>
     <w:p>
@@ -1306,7 +1306,29 @@
           <w:color w:val="444444"/>
           <w:sz w:val="20"/>
         </w:rPr>
-        <w:t>(a) Naive baseline: median RPM from non-outlier training rows × distance. (b) HGBR with squared_error loss on log(RPM). (c) HGBR with absolute_error loss on log(RPM). Both HGBR variants far outperform the baseline. squared_error was selected (avg non-outlier WAPE 3.34% vs 3.38% for absolute_error).</w:t>
+        <w:t>(a) Naive baseline: median RPM from non-outlier training rows × distance. (b) HGBR with squared_error loss on log(RPM). (c) HGBR with absolute_error loss on log(RPM). Both HGBR variants far outperform the baseline. squared_error was selected (avg non-outlier WAPE 2.66% vs 2.77% for absolute_error).</w:t>
+      </w:r>
+    </w:p>
+    <w:p>
+      <w:pPr>
+        <w:spacing w:after="80"/>
+      </w:pPr>
+      <w:r>
+        <w:rPr>
+          <w:rFonts w:ascii="Calibri" w:hAnsi="Calibri"/>
+          <w:b/>
+          <w:color w:val="064A56"/>
+          <w:sz w:val="20"/>
+        </w:rPr>
+        <w:t xml:space="preserve">Features (26 total):  </w:t>
+      </w:r>
+      <w:r>
+        <w:rPr>
+          <w:rFonts w:ascii="Calibri" w:hAnsi="Calibri"/>
+          <w:color w:val="444444"/>
+          <w:sz w:val="20"/>
+        </w:rPr>
+        <w:t>distance, hav_dist, road−haversine gap, weight_clean, market_index_filled, quote_signal, quote×distance, quote×haversine, day_of_week, day_of_month, is_weekend, week_of_month, pickup_lat/lon, delivery_lat/lon, lat_diff, lon_diff, equipment_enc, pickup_enc, delivery_enc, lane_enc, plus four market-context features: day_mi_median and day_qs_median (that date's median market_index and quote_signal over all loads), quote_rel (this load's quote_signal relative to its day's median) and day_index (days since 2025-01-01). All use inputs only, never the target. month_of_year is excluded; day_index is monotone, so every Nov–Dec date falls into the latest training period rather than being extrapolated.</w:t>
       </w:r>
     </w:p>
     <w:p>
@@ -1320,7 +1342,7 @@
           <w:color w:val="064A56"/>
           <w:sz w:val="20"/>
         </w:rPr>
-        <w:t xml:space="preserve">Features (22 total):  </w:t>
+        <w:t xml:space="preserve">Why the market-context features:  </w:t>
       </w:r>
       <w:r>
         <w:rPr>
@@ -1328,7 +1350,7 @@
           <w:color w:val="444444"/>
           <w:sz w:val="20"/>
         </w:rPr>
-        <w:t>distance, haversine_dist, road−haversine gap, weight_clean, market_index_filled, quote_signal, quote×distance, quote×haversine, day_of_week, day_of_month, is_weekend, week_of_month, pickup_lat/lon, delivery_lat/lon, lat_diff, lon_diff, equipment_enc, pickup_enc, delivery_enc, lane_enc. month_of_year and day_of_year are intentionally excluded — tree models cannot extrapolate a monotone trend to Nov–Dec.</w:t>
+        <w:t>market_index behaves like a daily market level (spread within a day 0.025, across days 0.167), and after removing lane and equipment effects it correlates 0.70 with that day's average price. With the original 22 features the model under-predicted in every fold (-2.0%, -2.3%, -3.3% mean signed error), a near-constant level offset that a model with no time information cannot see. Section 5 shows the effect of each addition.</w:t>
       </w:r>
     </w:p>
     <w:p>
@@ -1865,7 +1887,7 @@
                 <w:b/>
                 <w:sz w:val="17"/>
               </w:rPr>
-              <w:t>130.13</w:t>
+              <w:t>114.33</w:t>
             </w:r>
           </w:p>
         </w:tc>
@@ -1885,7 +1907,7 @@
                 <w:b/>
                 <w:sz w:val="17"/>
               </w:rPr>
-              <w:t>630.37</w:t>
+              <w:t>625.89</w:t>
             </w:r>
           </w:p>
         </w:tc>
@@ -1905,7 +1927,7 @@
                 <w:b/>
                 <w:sz w:val="17"/>
               </w:rPr>
-              <w:t>5.81</w:t>
+              <w:t>5.09</w:t>
             </w:r>
           </w:p>
         </w:tc>
@@ -1925,7 +1947,7 @@
                 <w:b/>
                 <w:sz w:val="17"/>
               </w:rPr>
-              <w:t>2.62</w:t>
+              <w:t>1.87</w:t>
             </w:r>
           </w:p>
         </w:tc>
@@ -1945,7 +1967,7 @@
                 <w:b/>
                 <w:sz w:val="17"/>
               </w:rPr>
-              <w:t>5.47</w:t>
+              <w:t>4.80</w:t>
             </w:r>
           </w:p>
         </w:tc>
@@ -2007,7 +2029,7 @@
                 <w:b/>
                 <w:sz w:val="17"/>
               </w:rPr>
-              <w:t>78.49</w:t>
+              <w:t>62.48</w:t>
             </w:r>
           </w:p>
         </w:tc>
@@ -2027,7 +2049,7 @@
                 <w:b/>
                 <w:sz w:val="17"/>
               </w:rPr>
-              <w:t>132.27</w:t>
+              <w:t>122.37</w:t>
             </w:r>
           </w:p>
         </w:tc>
@@ -2047,7 +2069,7 @@
                 <w:b/>
                 <w:sz w:val="17"/>
               </w:rPr>
-              <w:t>3.57</w:t>
+              <w:t>2.80</w:t>
             </w:r>
           </w:p>
         </w:tc>
@@ -2067,7 +2089,7 @@
                 <w:b/>
                 <w:sz w:val="17"/>
               </w:rPr>
-              <w:t>2.58</w:t>
+              <w:t>1.84</w:t>
             </w:r>
           </w:p>
         </w:tc>
@@ -2087,7 +2109,7 @@
                 <w:b/>
                 <w:sz w:val="17"/>
               </w:rPr>
-              <w:t>3.34</w:t>
+              <w:t>2.66</w:t>
             </w:r>
           </w:p>
         </w:tc>
@@ -2149,7 +2171,7 @@
                 <w:b w:val="0"/>
                 <w:sz w:val="17"/>
               </w:rPr>
-              <w:t>131.05</w:t>
+              <w:t>116.84</w:t>
             </w:r>
           </w:p>
         </w:tc>
@@ -2169,7 +2191,7 @@
                 <w:b w:val="0"/>
                 <w:sz w:val="17"/>
               </w:rPr>
-              <w:t>630.80</w:t>
+              <w:t>626.02</w:t>
             </w:r>
           </w:p>
         </w:tc>
@@ -2189,7 +2211,7 @@
                 <w:b w:val="0"/>
                 <w:sz w:val="17"/>
               </w:rPr>
-              <w:t>5.97</w:t>
+              <w:t>5.37</w:t>
             </w:r>
           </w:p>
         </w:tc>
@@ -2209,7 +2231,7 @@
                 <w:b w:val="0"/>
                 <w:sz w:val="17"/>
               </w:rPr>
-              <w:t>2.46</w:t>
+              <w:t>2.00</w:t>
             </w:r>
           </w:p>
         </w:tc>
@@ -2229,7 +2251,7 @@
                 <w:b w:val="0"/>
                 <w:sz w:val="17"/>
               </w:rPr>
-              <w:t>5.50</w:t>
+              <w:t>4.91</w:t>
             </w:r>
           </w:p>
         </w:tc>
@@ -2291,7 +2313,7 @@
                 <w:b w:val="0"/>
                 <w:sz w:val="17"/>
               </w:rPr>
-              <w:t>79.39</w:t>
+              <w:t>65.02</w:t>
             </w:r>
           </w:p>
         </w:tc>
@@ -2311,7 +2333,7 @@
                 <w:b w:val="0"/>
                 <w:sz w:val="17"/>
               </w:rPr>
-              <w:t>134.07</w:t>
+              <w:t>122.63</w:t>
             </w:r>
           </w:p>
         </w:tc>
@@ -2331,7 +2353,7 @@
                 <w:b w:val="0"/>
                 <w:sz w:val="17"/>
               </w:rPr>
-              <w:t>3.73</w:t>
+              <w:t>3.08</w:t>
             </w:r>
           </w:p>
         </w:tc>
@@ -2351,7 +2373,7 @@
                 <w:b w:val="0"/>
                 <w:sz w:val="17"/>
               </w:rPr>
-              <w:t>2.42</w:t>
+              <w:t>1.96</w:t>
             </w:r>
           </w:p>
         </w:tc>
@@ -2371,7 +2393,7 @@
                 <w:b w:val="0"/>
                 <w:sz w:val="17"/>
               </w:rPr>
-              <w:t>3.38</w:t>
+              <w:t>2.77</w:t>
             </w:r>
           </w:p>
         </w:tc>
@@ -2659,7 +2681,7 @@
                 <w:b w:val="0"/>
                 <w:sz w:val="17"/>
               </w:rPr>
-              <w:t>76.70</w:t>
+              <w:t>72.57</w:t>
             </w:r>
           </w:p>
         </w:tc>
@@ -2679,7 +2701,7 @@
                 <w:b w:val="0"/>
                 <w:sz w:val="17"/>
               </w:rPr>
-              <w:t>117.09</w:t>
+              <w:t>121.56</w:t>
             </w:r>
           </w:p>
         </w:tc>
@@ -2699,7 +2721,7 @@
                 <w:b w:val="0"/>
                 <w:sz w:val="17"/>
               </w:rPr>
-              <w:t>3.84</w:t>
+              <w:t>3.47</w:t>
             </w:r>
           </w:p>
         </w:tc>
@@ -2719,7 +2741,7 @@
                 <w:b w:val="0"/>
                 <w:sz w:val="17"/>
               </w:rPr>
-              <w:t>2.08</w:t>
+              <w:t>1.81</w:t>
             </w:r>
           </w:p>
         </w:tc>
@@ -2739,7 +2761,7 @@
                 <w:b w:val="0"/>
                 <w:sz w:val="17"/>
               </w:rPr>
-              <w:t>3.27</w:t>
+              <w:t>3.09</w:t>
             </w:r>
           </w:p>
         </w:tc>
@@ -2821,7 +2843,7 @@
                 <w:b w:val="0"/>
                 <w:sz w:val="17"/>
               </w:rPr>
-              <w:t>74.97</w:t>
+              <w:t>62.72</w:t>
             </w:r>
           </w:p>
         </w:tc>
@@ -2841,7 +2863,7 @@
                 <w:b w:val="0"/>
                 <w:sz w:val="17"/>
               </w:rPr>
-              <w:t>134.04</w:t>
+              <w:t>124.24</w:t>
             </w:r>
           </w:p>
         </w:tc>
@@ -2861,7 +2883,7 @@
                 <w:b w:val="0"/>
                 <w:sz w:val="17"/>
               </w:rPr>
-              <w:t>3.49</w:t>
+              <w:t>2.91</w:t>
             </w:r>
           </w:p>
         </w:tc>
@@ -2881,7 +2903,7 @@
                 <w:b w:val="0"/>
                 <w:sz w:val="17"/>
               </w:rPr>
-              <w:t>2.47</w:t>
+              <w:t>1.95</w:t>
             </w:r>
           </w:p>
         </w:tc>
@@ -2901,7 +2923,7 @@
                 <w:b w:val="0"/>
                 <w:sz w:val="17"/>
               </w:rPr>
-              <w:t>3.20</w:t>
+              <w:t>2.67</w:t>
             </w:r>
           </w:p>
         </w:tc>
@@ -2983,7 +3005,7 @@
                 <w:b w:val="0"/>
                 <w:sz w:val="17"/>
               </w:rPr>
-              <w:t>83.80</w:t>
+              <w:t>52.16</w:t>
             </w:r>
           </w:p>
         </w:tc>
@@ -3003,7 +3025,7 @@
                 <w:b w:val="0"/>
                 <w:sz w:val="17"/>
               </w:rPr>
-              <w:t>145.68</w:t>
+              <w:t>121.32</w:t>
             </w:r>
           </w:p>
         </w:tc>
@@ -3023,7 +3045,7 @@
                 <w:b w:val="0"/>
                 <w:sz w:val="17"/>
               </w:rPr>
-              <w:t>3.36</w:t>
+              <w:t>2.01</w:t>
             </w:r>
           </w:p>
         </w:tc>
@@ -3043,7 +3065,7 @@
                 <w:b w:val="0"/>
                 <w:sz w:val="17"/>
               </w:rPr>
-              <w:t>3.20</w:t>
+              <w:t>1.76</w:t>
             </w:r>
           </w:p>
         </w:tc>
@@ -3063,7 +3085,7 @@
                 <w:b w:val="0"/>
                 <w:sz w:val="17"/>
               </w:rPr>
-              <w:t>3.55</w:t>
+              <w:t>2.21</w:t>
             </w:r>
           </w:p>
         </w:tc>
@@ -3145,7 +3167,7 @@
                 <w:b/>
                 <w:sz w:val="17"/>
               </w:rPr>
-              <w:t>78.49</w:t>
+              <w:t>62.48</w:t>
             </w:r>
           </w:p>
         </w:tc>
@@ -3165,7 +3187,7 @@
                 <w:b/>
                 <w:sz w:val="17"/>
               </w:rPr>
-              <w:t>132.27</w:t>
+              <w:t>122.37</w:t>
             </w:r>
           </w:p>
         </w:tc>
@@ -3185,7 +3207,7 @@
                 <w:b/>
                 <w:sz w:val="17"/>
               </w:rPr>
-              <w:t>3.57</w:t>
+              <w:t>2.80</w:t>
             </w:r>
           </w:p>
         </w:tc>
@@ -3205,7 +3227,7 @@
                 <w:b/>
                 <w:sz w:val="17"/>
               </w:rPr>
-              <w:t>2.58</w:t>
+              <w:t>1.84</w:t>
             </w:r>
           </w:p>
         </w:tc>
@@ -3225,7 +3247,1145 @@
                 <w:b/>
                 <w:sz w:val="17"/>
               </w:rPr>
+              <w:t>2.66</w:t>
+            </w:r>
+          </w:p>
+        </w:tc>
+      </w:tr>
+    </w:tbl>
+    <w:p>
+      <w:pPr>
+        <w:spacing w:after="60"/>
+      </w:pPr>
+    </w:p>
+    <w:p>
+      <w:pPr>
+        <w:spacing w:after="60"/>
+      </w:pPr>
+      <w:r>
+        <w:rPr>
+          <w:rFonts w:ascii="Calibri" w:hAnsi="Calibri"/>
+          <w:color w:val="444444"/>
+          <w:sz w:val="20"/>
+        </w:rPr>
+        <w:t>Where the improvement comes from — one change at a time, same 3 folds, squared_error loss, non-outlier WAPE (%). Produced by src/ablation.py (outputs/ablation_results.csv). The last four rows vary the recency decay constant (days); 60–120 days gives nearly the same result, so the outcome does not hinge on the exact value.</w:t>
+      </w:r>
+    </w:p>
+    <w:tbl>
+      <w:tblPr>
+        <w:tblStyle w:val="TableGrid"/>
+        <w:tblW w:type="auto" w:w="0"/>
+        <w:jc w:val="left"/>
+        <w:tblLook w:firstColumn="1" w:firstRow="1" w:lastColumn="0" w:lastRow="0" w:noHBand="0" w:noVBand="1" w:val="04A0"/>
+      </w:tblPr>
+      <w:tblGrid>
+        <w:gridCol w:w="1560"/>
+        <w:gridCol w:w="1560"/>
+        <w:gridCol w:w="1560"/>
+        <w:gridCol w:w="1560"/>
+        <w:gridCol w:w="1560"/>
+        <w:gridCol w:w="1560"/>
+      </w:tblGrid>
+      <w:tr>
+        <w:tc>
+          <w:tcPr>
+            <w:tcW w:type="dxa" w:w="1560"/>
+            <w:shd w:val="clear" w:color="auto" w:fill="1A8A9E"/>
+            <w:vAlign w:val="center"/>
+          </w:tcPr>
+          <w:p>
+            <w:pPr>
+              <w:jc w:val="center"/>
+            </w:pPr>
+            <w:r>
+              <w:rPr>
+                <w:rFonts w:ascii="Calibri" w:hAnsi="Calibri"/>
+                <w:b/>
+                <w:color w:val="FFFFFF"/>
+                <w:sz w:val="17"/>
+              </w:rPr>
+              <w:t>Configuration</w:t>
+            </w:r>
+          </w:p>
+        </w:tc>
+        <w:tc>
+          <w:tcPr>
+            <w:tcW w:type="dxa" w:w="1560"/>
+            <w:shd w:val="clear" w:color="auto" w:fill="1A8A9E"/>
+            <w:vAlign w:val="center"/>
+          </w:tcPr>
+          <w:p>
+            <w:pPr>
+              <w:jc w:val="center"/>
+            </w:pPr>
+            <w:r>
+              <w:rPr>
+                <w:rFonts w:ascii="Calibri" w:hAnsi="Calibri"/>
+                <w:b/>
+                <w:color w:val="FFFFFF"/>
+                <w:sz w:val="17"/>
+              </w:rPr>
+              <w:t>Fold 1</w:t>
+            </w:r>
+          </w:p>
+        </w:tc>
+        <w:tc>
+          <w:tcPr>
+            <w:tcW w:type="dxa" w:w="1560"/>
+            <w:shd w:val="clear" w:color="auto" w:fill="1A8A9E"/>
+            <w:vAlign w:val="center"/>
+          </w:tcPr>
+          <w:p>
+            <w:pPr>
+              <w:jc w:val="center"/>
+            </w:pPr>
+            <w:r>
+              <w:rPr>
+                <w:rFonts w:ascii="Calibri" w:hAnsi="Calibri"/>
+                <w:b/>
+                <w:color w:val="FFFFFF"/>
+                <w:sz w:val="17"/>
+              </w:rPr>
+              <w:t>Fold 2</w:t>
+            </w:r>
+          </w:p>
+        </w:tc>
+        <w:tc>
+          <w:tcPr>
+            <w:tcW w:type="dxa" w:w="1560"/>
+            <w:shd w:val="clear" w:color="auto" w:fill="1A8A9E"/>
+            <w:vAlign w:val="center"/>
+          </w:tcPr>
+          <w:p>
+            <w:pPr>
+              <w:jc w:val="center"/>
+            </w:pPr>
+            <w:r>
+              <w:rPr>
+                <w:rFonts w:ascii="Calibri" w:hAnsi="Calibri"/>
+                <w:b/>
+                <w:color w:val="FFFFFF"/>
+                <w:sz w:val="17"/>
+              </w:rPr>
+              <w:t>Fold 3</w:t>
+            </w:r>
+          </w:p>
+        </w:tc>
+        <w:tc>
+          <w:tcPr>
+            <w:tcW w:type="dxa" w:w="1560"/>
+            <w:shd w:val="clear" w:color="auto" w:fill="1A8A9E"/>
+            <w:vAlign w:val="center"/>
+          </w:tcPr>
+          <w:p>
+            <w:pPr>
+              <w:jc w:val="center"/>
+            </w:pPr>
+            <w:r>
+              <w:rPr>
+                <w:rFonts w:ascii="Calibri" w:hAnsi="Calibri"/>
+                <w:b/>
+                <w:color w:val="FFFFFF"/>
+                <w:sz w:val="17"/>
+              </w:rPr>
+              <w:t>Avg (non-outlier)</w:t>
+            </w:r>
+          </w:p>
+        </w:tc>
+        <w:tc>
+          <w:tcPr>
+            <w:tcW w:type="dxa" w:w="1560"/>
+            <w:shd w:val="clear" w:color="auto" w:fill="1A8A9E"/>
+            <w:vAlign w:val="center"/>
+          </w:tcPr>
+          <w:p>
+            <w:pPr>
+              <w:jc w:val="center"/>
+            </w:pPr>
+            <w:r>
+              <w:rPr>
+                <w:rFonts w:ascii="Calibri" w:hAnsi="Calibri"/>
+                <w:b/>
+                <w:color w:val="FFFFFF"/>
+                <w:sz w:val="17"/>
+              </w:rPr>
+              <w:t>Avg (all rows)</w:t>
+            </w:r>
+          </w:p>
+        </w:tc>
+      </w:tr>
+      <w:tr>
+        <w:tc>
+          <w:tcPr>
+            <w:tcW w:type="dxa" w:w="1560"/>
+            <w:shd w:val="clear" w:color="auto" w:fill="FFFFFF"/>
+            <w:vAlign w:val="center"/>
+          </w:tcPr>
+          <w:p>
+            <w:pPr>
+              <w:jc w:val="left"/>
+            </w:pPr>
+            <w:r>
+              <w:rPr>
+                <w:rFonts w:ascii="Calibri" w:hAnsi="Calibri"/>
+                <w:b w:val="0"/>
+                <w:sz w:val="17"/>
+              </w:rPr>
+              <w:t>A: original 22 features</w:t>
+            </w:r>
+          </w:p>
+        </w:tc>
+        <w:tc>
+          <w:tcPr>
+            <w:tcW w:type="dxa" w:w="1560"/>
+            <w:shd w:val="clear" w:color="auto" w:fill="FFFFFF"/>
+            <w:vAlign w:val="center"/>
+          </w:tcPr>
+          <w:p>
+            <w:pPr>
+              <w:jc w:val="center"/>
+            </w:pPr>
+            <w:r>
+              <w:rPr>
+                <w:rFonts w:ascii="Calibri" w:hAnsi="Calibri"/>
+                <w:b w:val="0"/>
+                <w:sz w:val="17"/>
+              </w:rPr>
+              <w:t>3.27</w:t>
+            </w:r>
+          </w:p>
+        </w:tc>
+        <w:tc>
+          <w:tcPr>
+            <w:tcW w:type="dxa" w:w="1560"/>
+            <w:shd w:val="clear" w:color="auto" w:fill="FFFFFF"/>
+            <w:vAlign w:val="center"/>
+          </w:tcPr>
+          <w:p>
+            <w:pPr>
+              <w:jc w:val="center"/>
+            </w:pPr>
+            <w:r>
+              <w:rPr>
+                <w:rFonts w:ascii="Calibri" w:hAnsi="Calibri"/>
+                <w:b w:val="0"/>
+                <w:sz w:val="17"/>
+              </w:rPr>
+              <w:t>3.20</w:t>
+            </w:r>
+          </w:p>
+        </w:tc>
+        <w:tc>
+          <w:tcPr>
+            <w:tcW w:type="dxa" w:w="1560"/>
+            <w:shd w:val="clear" w:color="auto" w:fill="FFFFFF"/>
+            <w:vAlign w:val="center"/>
+          </w:tcPr>
+          <w:p>
+            <w:pPr>
+              <w:jc w:val="center"/>
+            </w:pPr>
+            <w:r>
+              <w:rPr>
+                <w:rFonts w:ascii="Calibri" w:hAnsi="Calibri"/>
+                <w:b w:val="0"/>
+                <w:sz w:val="17"/>
+              </w:rPr>
+              <w:t>3.55</w:t>
+            </w:r>
+          </w:p>
+        </w:tc>
+        <w:tc>
+          <w:tcPr>
+            <w:tcW w:type="dxa" w:w="1560"/>
+            <w:shd w:val="clear" w:color="auto" w:fill="FFFFFF"/>
+            <w:vAlign w:val="center"/>
+          </w:tcPr>
+          <w:p>
+            <w:pPr>
+              <w:jc w:val="center"/>
+            </w:pPr>
+            <w:r>
+              <w:rPr>
+                <w:rFonts w:ascii="Calibri" w:hAnsi="Calibri"/>
+                <w:b w:val="0"/>
+                <w:sz w:val="17"/>
+              </w:rPr>
               <w:t>3.34</w:t>
+            </w:r>
+          </w:p>
+        </w:tc>
+        <w:tc>
+          <w:tcPr>
+            <w:tcW w:type="dxa" w:w="1560"/>
+            <w:shd w:val="clear" w:color="auto" w:fill="FFFFFF"/>
+            <w:vAlign w:val="center"/>
+          </w:tcPr>
+          <w:p>
+            <w:pPr>
+              <w:jc w:val="center"/>
+            </w:pPr>
+            <w:r>
+              <w:rPr>
+                <w:rFonts w:ascii="Calibri" w:hAnsi="Calibri"/>
+                <w:b w:val="0"/>
+                <w:sz w:val="17"/>
+              </w:rPr>
+              <w:t>5.47</w:t>
+            </w:r>
+          </w:p>
+        </w:tc>
+      </w:tr>
+      <w:tr>
+        <w:tc>
+          <w:tcPr>
+            <w:tcW w:type="dxa" w:w="1560"/>
+            <w:shd w:val="clear" w:color="auto" w:fill="EFF6F7"/>
+            <w:vAlign w:val="center"/>
+          </w:tcPr>
+          <w:p>
+            <w:pPr>
+              <w:jc w:val="left"/>
+            </w:pPr>
+            <w:r>
+              <w:rPr>
+                <w:rFonts w:ascii="Calibri" w:hAnsi="Calibri"/>
+                <w:b w:val="0"/>
+                <w:sz w:val="17"/>
+              </w:rPr>
+              <w:t>B: + day-level market features</w:t>
+            </w:r>
+          </w:p>
+        </w:tc>
+        <w:tc>
+          <w:tcPr>
+            <w:tcW w:type="dxa" w:w="1560"/>
+            <w:shd w:val="clear" w:color="auto" w:fill="EFF6F7"/>
+            <w:vAlign w:val="center"/>
+          </w:tcPr>
+          <w:p>
+            <w:pPr>
+              <w:jc w:val="center"/>
+            </w:pPr>
+            <w:r>
+              <w:rPr>
+                <w:rFonts w:ascii="Calibri" w:hAnsi="Calibri"/>
+                <w:b w:val="0"/>
+                <w:sz w:val="17"/>
+              </w:rPr>
+              <w:t>3.39</w:t>
+            </w:r>
+          </w:p>
+        </w:tc>
+        <w:tc>
+          <w:tcPr>
+            <w:tcW w:type="dxa" w:w="1560"/>
+            <w:shd w:val="clear" w:color="auto" w:fill="EFF6F7"/>
+            <w:vAlign w:val="center"/>
+          </w:tcPr>
+          <w:p>
+            <w:pPr>
+              <w:jc w:val="center"/>
+            </w:pPr>
+            <w:r>
+              <w:rPr>
+                <w:rFonts w:ascii="Calibri" w:hAnsi="Calibri"/>
+                <w:b w:val="0"/>
+                <w:sz w:val="17"/>
+              </w:rPr>
+              <w:t>3.00</w:t>
+            </w:r>
+          </w:p>
+        </w:tc>
+        <w:tc>
+          <w:tcPr>
+            <w:tcW w:type="dxa" w:w="1560"/>
+            <w:shd w:val="clear" w:color="auto" w:fill="EFF6F7"/>
+            <w:vAlign w:val="center"/>
+          </w:tcPr>
+          <w:p>
+            <w:pPr>
+              <w:jc w:val="center"/>
+            </w:pPr>
+            <w:r>
+              <w:rPr>
+                <w:rFonts w:ascii="Calibri" w:hAnsi="Calibri"/>
+                <w:b w:val="0"/>
+                <w:sz w:val="17"/>
+              </w:rPr>
+              <w:t>2.70</w:t>
+            </w:r>
+          </w:p>
+        </w:tc>
+        <w:tc>
+          <w:tcPr>
+            <w:tcW w:type="dxa" w:w="1560"/>
+            <w:shd w:val="clear" w:color="auto" w:fill="EFF6F7"/>
+            <w:vAlign w:val="center"/>
+          </w:tcPr>
+          <w:p>
+            <w:pPr>
+              <w:jc w:val="center"/>
+            </w:pPr>
+            <w:r>
+              <w:rPr>
+                <w:rFonts w:ascii="Calibri" w:hAnsi="Calibri"/>
+                <w:b w:val="0"/>
+                <w:sz w:val="17"/>
+              </w:rPr>
+              <w:t>3.03</w:t>
+            </w:r>
+          </w:p>
+        </w:tc>
+        <w:tc>
+          <w:tcPr>
+            <w:tcW w:type="dxa" w:w="1560"/>
+            <w:shd w:val="clear" w:color="auto" w:fill="EFF6F7"/>
+            <w:vAlign w:val="center"/>
+          </w:tcPr>
+          <w:p>
+            <w:pPr>
+              <w:jc w:val="center"/>
+            </w:pPr>
+            <w:r>
+              <w:rPr>
+                <w:rFonts w:ascii="Calibri" w:hAnsi="Calibri"/>
+                <w:b w:val="0"/>
+                <w:sz w:val="17"/>
+              </w:rPr>
+              <w:t>5.17</w:t>
+            </w:r>
+          </w:p>
+        </w:tc>
+      </w:tr>
+      <w:tr>
+        <w:tc>
+          <w:tcPr>
+            <w:tcW w:type="dxa" w:w="1560"/>
+            <w:shd w:val="clear" w:color="auto" w:fill="FFFFFF"/>
+            <w:vAlign w:val="center"/>
+          </w:tcPr>
+          <w:p>
+            <w:pPr>
+              <w:jc w:val="left"/>
+            </w:pPr>
+            <w:r>
+              <w:rPr>
+                <w:rFonts w:ascii="Calibri" w:hAnsi="Calibri"/>
+                <w:b w:val="0"/>
+                <w:sz w:val="17"/>
+              </w:rPr>
+              <w:t>C: + day_index</w:t>
+            </w:r>
+          </w:p>
+        </w:tc>
+        <w:tc>
+          <w:tcPr>
+            <w:tcW w:type="dxa" w:w="1560"/>
+            <w:shd w:val="clear" w:color="auto" w:fill="FFFFFF"/>
+            <w:vAlign w:val="center"/>
+          </w:tcPr>
+          <w:p>
+            <w:pPr>
+              <w:jc w:val="center"/>
+            </w:pPr>
+            <w:r>
+              <w:rPr>
+                <w:rFonts w:ascii="Calibri" w:hAnsi="Calibri"/>
+                <w:b w:val="0"/>
+                <w:sz w:val="17"/>
+              </w:rPr>
+              <w:t>3.47</w:t>
+            </w:r>
+          </w:p>
+        </w:tc>
+        <w:tc>
+          <w:tcPr>
+            <w:tcW w:type="dxa" w:w="1560"/>
+            <w:shd w:val="clear" w:color="auto" w:fill="FFFFFF"/>
+            <w:vAlign w:val="center"/>
+          </w:tcPr>
+          <w:p>
+            <w:pPr>
+              <w:jc w:val="center"/>
+            </w:pPr>
+            <w:r>
+              <w:rPr>
+                <w:rFonts w:ascii="Calibri" w:hAnsi="Calibri"/>
+                <w:b w:val="0"/>
+                <w:sz w:val="17"/>
+              </w:rPr>
+              <w:t>3.00</w:t>
+            </w:r>
+          </w:p>
+        </w:tc>
+        <w:tc>
+          <w:tcPr>
+            <w:tcW w:type="dxa" w:w="1560"/>
+            <w:shd w:val="clear" w:color="auto" w:fill="FFFFFF"/>
+            <w:vAlign w:val="center"/>
+          </w:tcPr>
+          <w:p>
+            <w:pPr>
+              <w:jc w:val="center"/>
+            </w:pPr>
+            <w:r>
+              <w:rPr>
+                <w:rFonts w:ascii="Calibri" w:hAnsi="Calibri"/>
+                <w:b w:val="0"/>
+                <w:sz w:val="17"/>
+              </w:rPr>
+              <w:t>2.00</w:t>
+            </w:r>
+          </w:p>
+        </w:tc>
+        <w:tc>
+          <w:tcPr>
+            <w:tcW w:type="dxa" w:w="1560"/>
+            <w:shd w:val="clear" w:color="auto" w:fill="FFFFFF"/>
+            <w:vAlign w:val="center"/>
+          </w:tcPr>
+          <w:p>
+            <w:pPr>
+              <w:jc w:val="center"/>
+            </w:pPr>
+            <w:r>
+              <w:rPr>
+                <w:rFonts w:ascii="Calibri" w:hAnsi="Calibri"/>
+                <w:b w:val="0"/>
+                <w:sz w:val="17"/>
+              </w:rPr>
+              <w:t>2.83</w:t>
+            </w:r>
+          </w:p>
+        </w:tc>
+        <w:tc>
+          <w:tcPr>
+            <w:tcW w:type="dxa" w:w="1560"/>
+            <w:shd w:val="clear" w:color="auto" w:fill="FFFFFF"/>
+            <w:vAlign w:val="center"/>
+          </w:tcPr>
+          <w:p>
+            <w:pPr>
+              <w:jc w:val="center"/>
+            </w:pPr>
+            <w:r>
+              <w:rPr>
+                <w:rFonts w:ascii="Calibri" w:hAnsi="Calibri"/>
+                <w:b w:val="0"/>
+                <w:sz w:val="17"/>
+              </w:rPr>
+              <w:t>4.97</w:t>
+            </w:r>
+          </w:p>
+        </w:tc>
+      </w:tr>
+      <w:tr>
+        <w:tc>
+          <w:tcPr>
+            <w:tcW w:type="dxa" w:w="1560"/>
+            <w:shd w:val="clear" w:color="auto" w:fill="C8E6C9"/>
+            <w:vAlign w:val="center"/>
+          </w:tcPr>
+          <w:p>
+            <w:pPr>
+              <w:jc w:val="left"/>
+            </w:pPr>
+            <w:r>
+              <w:rPr>
+                <w:rFonts w:ascii="Calibri" w:hAnsi="Calibri"/>
+                <w:b/>
+                <w:sz w:val="17"/>
+              </w:rPr>
+              <w:t>D: + recency weighting (90 d) [final]</w:t>
+            </w:r>
+          </w:p>
+        </w:tc>
+        <w:tc>
+          <w:tcPr>
+            <w:tcW w:type="dxa" w:w="1560"/>
+            <w:shd w:val="clear" w:color="auto" w:fill="C8E6C9"/>
+            <w:vAlign w:val="center"/>
+          </w:tcPr>
+          <w:p>
+            <w:pPr>
+              <w:jc w:val="center"/>
+            </w:pPr>
+            <w:r>
+              <w:rPr>
+                <w:rFonts w:ascii="Calibri" w:hAnsi="Calibri"/>
+                <w:b/>
+                <w:sz w:val="17"/>
+              </w:rPr>
+              <w:t>3.09</w:t>
+            </w:r>
+          </w:p>
+        </w:tc>
+        <w:tc>
+          <w:tcPr>
+            <w:tcW w:type="dxa" w:w="1560"/>
+            <w:shd w:val="clear" w:color="auto" w:fill="C8E6C9"/>
+            <w:vAlign w:val="center"/>
+          </w:tcPr>
+          <w:p>
+            <w:pPr>
+              <w:jc w:val="center"/>
+            </w:pPr>
+            <w:r>
+              <w:rPr>
+                <w:rFonts w:ascii="Calibri" w:hAnsi="Calibri"/>
+                <w:b/>
+                <w:sz w:val="17"/>
+              </w:rPr>
+              <w:t>2.67</w:t>
+            </w:r>
+          </w:p>
+        </w:tc>
+        <w:tc>
+          <w:tcPr>
+            <w:tcW w:type="dxa" w:w="1560"/>
+            <w:shd w:val="clear" w:color="auto" w:fill="C8E6C9"/>
+            <w:vAlign w:val="center"/>
+          </w:tcPr>
+          <w:p>
+            <w:pPr>
+              <w:jc w:val="center"/>
+            </w:pPr>
+            <w:r>
+              <w:rPr>
+                <w:rFonts w:ascii="Calibri" w:hAnsi="Calibri"/>
+                <w:b/>
+                <w:sz w:val="17"/>
+              </w:rPr>
+              <w:t>2.21</w:t>
+            </w:r>
+          </w:p>
+        </w:tc>
+        <w:tc>
+          <w:tcPr>
+            <w:tcW w:type="dxa" w:w="1560"/>
+            <w:shd w:val="clear" w:color="auto" w:fill="C8E6C9"/>
+            <w:vAlign w:val="center"/>
+          </w:tcPr>
+          <w:p>
+            <w:pPr>
+              <w:jc w:val="center"/>
+            </w:pPr>
+            <w:r>
+              <w:rPr>
+                <w:rFonts w:ascii="Calibri" w:hAnsi="Calibri"/>
+                <w:b/>
+                <w:sz w:val="17"/>
+              </w:rPr>
+              <w:t>2.66</w:t>
+            </w:r>
+          </w:p>
+        </w:tc>
+        <w:tc>
+          <w:tcPr>
+            <w:tcW w:type="dxa" w:w="1560"/>
+            <w:shd w:val="clear" w:color="auto" w:fill="C8E6C9"/>
+            <w:vAlign w:val="center"/>
+          </w:tcPr>
+          <w:p>
+            <w:pPr>
+              <w:jc w:val="center"/>
+            </w:pPr>
+            <w:r>
+              <w:rPr>
+                <w:rFonts w:ascii="Calibri" w:hAnsi="Calibri"/>
+                <w:b/>
+                <w:sz w:val="17"/>
+              </w:rPr>
+              <w:t>4.80</w:t>
+            </w:r>
+          </w:p>
+        </w:tc>
+      </w:tr>
+      <w:tr>
+        <w:tc>
+          <w:tcPr>
+            <w:tcW w:type="dxa" w:w="1560"/>
+            <w:shd w:val="clear" w:color="auto" w:fill="FFFFFF"/>
+            <w:vAlign w:val="center"/>
+          </w:tcPr>
+          <w:p>
+            <w:pPr>
+              <w:jc w:val="left"/>
+            </w:pPr>
+            <w:r>
+              <w:rPr>
+                <w:rFonts w:ascii="Calibri" w:hAnsi="Calibri"/>
+                <w:b w:val="0"/>
+                <w:sz w:val="17"/>
+              </w:rPr>
+              <w:t>D with recency 30 d</w:t>
+            </w:r>
+          </w:p>
+        </w:tc>
+        <w:tc>
+          <w:tcPr>
+            <w:tcW w:type="dxa" w:w="1560"/>
+            <w:shd w:val="clear" w:color="auto" w:fill="FFFFFF"/>
+            <w:vAlign w:val="center"/>
+          </w:tcPr>
+          <w:p>
+            <w:pPr>
+              <w:jc w:val="center"/>
+            </w:pPr>
+            <w:r>
+              <w:rPr>
+                <w:rFonts w:ascii="Calibri" w:hAnsi="Calibri"/>
+                <w:b w:val="0"/>
+                <w:sz w:val="17"/>
+              </w:rPr>
+              <w:t>3.30</w:t>
+            </w:r>
+          </w:p>
+        </w:tc>
+        <w:tc>
+          <w:tcPr>
+            <w:tcW w:type="dxa" w:w="1560"/>
+            <w:shd w:val="clear" w:color="auto" w:fill="FFFFFF"/>
+            <w:vAlign w:val="center"/>
+          </w:tcPr>
+          <w:p>
+            <w:pPr>
+              <w:jc w:val="center"/>
+            </w:pPr>
+            <w:r>
+              <w:rPr>
+                <w:rFonts w:ascii="Calibri" w:hAnsi="Calibri"/>
+                <w:b w:val="0"/>
+                <w:sz w:val="17"/>
+              </w:rPr>
+              <w:t>3.29</w:t>
+            </w:r>
+          </w:p>
+        </w:tc>
+        <w:tc>
+          <w:tcPr>
+            <w:tcW w:type="dxa" w:w="1560"/>
+            <w:shd w:val="clear" w:color="auto" w:fill="FFFFFF"/>
+            <w:vAlign w:val="center"/>
+          </w:tcPr>
+          <w:p>
+            <w:pPr>
+              <w:jc w:val="center"/>
+            </w:pPr>
+            <w:r>
+              <w:rPr>
+                <w:rFonts w:ascii="Calibri" w:hAnsi="Calibri"/>
+                <w:b w:val="0"/>
+                <w:sz w:val="17"/>
+              </w:rPr>
+              <w:t>2.28</w:t>
+            </w:r>
+          </w:p>
+        </w:tc>
+        <w:tc>
+          <w:tcPr>
+            <w:tcW w:type="dxa" w:w="1560"/>
+            <w:shd w:val="clear" w:color="auto" w:fill="FFFFFF"/>
+            <w:vAlign w:val="center"/>
+          </w:tcPr>
+          <w:p>
+            <w:pPr>
+              <w:jc w:val="center"/>
+            </w:pPr>
+            <w:r>
+              <w:rPr>
+                <w:rFonts w:ascii="Calibri" w:hAnsi="Calibri"/>
+                <w:b w:val="0"/>
+                <w:sz w:val="17"/>
+              </w:rPr>
+              <w:t>2.96</w:t>
+            </w:r>
+          </w:p>
+        </w:tc>
+        <w:tc>
+          <w:tcPr>
+            <w:tcW w:type="dxa" w:w="1560"/>
+            <w:shd w:val="clear" w:color="auto" w:fill="FFFFFF"/>
+            <w:vAlign w:val="center"/>
+          </w:tcPr>
+          <w:p>
+            <w:pPr>
+              <w:jc w:val="center"/>
+            </w:pPr>
+            <w:r>
+              <w:rPr>
+                <w:rFonts w:ascii="Calibri" w:hAnsi="Calibri"/>
+                <w:b w:val="0"/>
+                <w:sz w:val="17"/>
+              </w:rPr>
+              <w:t>5.10</w:t>
+            </w:r>
+          </w:p>
+        </w:tc>
+      </w:tr>
+      <w:tr>
+        <w:tc>
+          <w:tcPr>
+            <w:tcW w:type="dxa" w:w="1560"/>
+            <w:shd w:val="clear" w:color="auto" w:fill="EFF6F7"/>
+            <w:vAlign w:val="center"/>
+          </w:tcPr>
+          <w:p>
+            <w:pPr>
+              <w:jc w:val="left"/>
+            </w:pPr>
+            <w:r>
+              <w:rPr>
+                <w:rFonts w:ascii="Calibri" w:hAnsi="Calibri"/>
+                <w:b w:val="0"/>
+                <w:sz w:val="17"/>
+              </w:rPr>
+              <w:t>D with recency 60 d</w:t>
+            </w:r>
+          </w:p>
+        </w:tc>
+        <w:tc>
+          <w:tcPr>
+            <w:tcW w:type="dxa" w:w="1560"/>
+            <w:shd w:val="clear" w:color="auto" w:fill="EFF6F7"/>
+            <w:vAlign w:val="center"/>
+          </w:tcPr>
+          <w:p>
+            <w:pPr>
+              <w:jc w:val="center"/>
+            </w:pPr>
+            <w:r>
+              <w:rPr>
+                <w:rFonts w:ascii="Calibri" w:hAnsi="Calibri"/>
+                <w:b w:val="0"/>
+                <w:sz w:val="17"/>
+              </w:rPr>
+              <w:t>3.13</w:t>
+            </w:r>
+          </w:p>
+        </w:tc>
+        <w:tc>
+          <w:tcPr>
+            <w:tcW w:type="dxa" w:w="1560"/>
+            <w:shd w:val="clear" w:color="auto" w:fill="EFF6F7"/>
+            <w:vAlign w:val="center"/>
+          </w:tcPr>
+          <w:p>
+            <w:pPr>
+              <w:jc w:val="center"/>
+            </w:pPr>
+            <w:r>
+              <w:rPr>
+                <w:rFonts w:ascii="Calibri" w:hAnsi="Calibri"/>
+                <w:b w:val="0"/>
+                <w:sz w:val="17"/>
+              </w:rPr>
+              <w:t>2.72</w:t>
+            </w:r>
+          </w:p>
+        </w:tc>
+        <w:tc>
+          <w:tcPr>
+            <w:tcW w:type="dxa" w:w="1560"/>
+            <w:shd w:val="clear" w:color="auto" w:fill="EFF6F7"/>
+            <w:vAlign w:val="center"/>
+          </w:tcPr>
+          <w:p>
+            <w:pPr>
+              <w:jc w:val="center"/>
+            </w:pPr>
+            <w:r>
+              <w:rPr>
+                <w:rFonts w:ascii="Calibri" w:hAnsi="Calibri"/>
+                <w:b w:val="0"/>
+                <w:sz w:val="17"/>
+              </w:rPr>
+              <w:t>2.24</w:t>
+            </w:r>
+          </w:p>
+        </w:tc>
+        <w:tc>
+          <w:tcPr>
+            <w:tcW w:type="dxa" w:w="1560"/>
+            <w:shd w:val="clear" w:color="auto" w:fill="EFF6F7"/>
+            <w:vAlign w:val="center"/>
+          </w:tcPr>
+          <w:p>
+            <w:pPr>
+              <w:jc w:val="center"/>
+            </w:pPr>
+            <w:r>
+              <w:rPr>
+                <w:rFonts w:ascii="Calibri" w:hAnsi="Calibri"/>
+                <w:b w:val="0"/>
+                <w:sz w:val="17"/>
+              </w:rPr>
+              <w:t>2.70</w:t>
+            </w:r>
+          </w:p>
+        </w:tc>
+        <w:tc>
+          <w:tcPr>
+            <w:tcW w:type="dxa" w:w="1560"/>
+            <w:shd w:val="clear" w:color="auto" w:fill="EFF6F7"/>
+            <w:vAlign w:val="center"/>
+          </w:tcPr>
+          <w:p>
+            <w:pPr>
+              <w:jc w:val="center"/>
+            </w:pPr>
+            <w:r>
+              <w:rPr>
+                <w:rFonts w:ascii="Calibri" w:hAnsi="Calibri"/>
+                <w:b w:val="0"/>
+                <w:sz w:val="17"/>
+              </w:rPr>
+              <w:t>4.84</w:t>
+            </w:r>
+          </w:p>
+        </w:tc>
+      </w:tr>
+      <w:tr>
+        <w:tc>
+          <w:tcPr>
+            <w:tcW w:type="dxa" w:w="1560"/>
+            <w:shd w:val="clear" w:color="auto" w:fill="FFFFFF"/>
+            <w:vAlign w:val="center"/>
+          </w:tcPr>
+          <w:p>
+            <w:pPr>
+              <w:jc w:val="left"/>
+            </w:pPr>
+            <w:r>
+              <w:rPr>
+                <w:rFonts w:ascii="Calibri" w:hAnsi="Calibri"/>
+                <w:b w:val="0"/>
+                <w:sz w:val="17"/>
+              </w:rPr>
+              <w:t>D with recency 120 d</w:t>
+            </w:r>
+          </w:p>
+        </w:tc>
+        <w:tc>
+          <w:tcPr>
+            <w:tcW w:type="dxa" w:w="1560"/>
+            <w:shd w:val="clear" w:color="auto" w:fill="FFFFFF"/>
+            <w:vAlign w:val="center"/>
+          </w:tcPr>
+          <w:p>
+            <w:pPr>
+              <w:jc w:val="center"/>
+            </w:pPr>
+            <w:r>
+              <w:rPr>
+                <w:rFonts w:ascii="Calibri" w:hAnsi="Calibri"/>
+                <w:b w:val="0"/>
+                <w:sz w:val="17"/>
+              </w:rPr>
+              <w:t>3.15</w:t>
+            </w:r>
+          </w:p>
+        </w:tc>
+        <w:tc>
+          <w:tcPr>
+            <w:tcW w:type="dxa" w:w="1560"/>
+            <w:shd w:val="clear" w:color="auto" w:fill="FFFFFF"/>
+            <w:vAlign w:val="center"/>
+          </w:tcPr>
+          <w:p>
+            <w:pPr>
+              <w:jc w:val="center"/>
+            </w:pPr>
+            <w:r>
+              <w:rPr>
+                <w:rFonts w:ascii="Calibri" w:hAnsi="Calibri"/>
+                <w:b w:val="0"/>
+                <w:sz w:val="17"/>
+              </w:rPr>
+              <w:t>2.72</w:t>
+            </w:r>
+          </w:p>
+        </w:tc>
+        <w:tc>
+          <w:tcPr>
+            <w:tcW w:type="dxa" w:w="1560"/>
+            <w:shd w:val="clear" w:color="auto" w:fill="FFFFFF"/>
+            <w:vAlign w:val="center"/>
+          </w:tcPr>
+          <w:p>
+            <w:pPr>
+              <w:jc w:val="center"/>
+            </w:pPr>
+            <w:r>
+              <w:rPr>
+                <w:rFonts w:ascii="Calibri" w:hAnsi="Calibri"/>
+                <w:b w:val="0"/>
+                <w:sz w:val="17"/>
+              </w:rPr>
+              <w:t>2.18</w:t>
+            </w:r>
+          </w:p>
+        </w:tc>
+        <w:tc>
+          <w:tcPr>
+            <w:tcW w:type="dxa" w:w="1560"/>
+            <w:shd w:val="clear" w:color="auto" w:fill="FFFFFF"/>
+            <w:vAlign w:val="center"/>
+          </w:tcPr>
+          <w:p>
+            <w:pPr>
+              <w:jc w:val="center"/>
+            </w:pPr>
+            <w:r>
+              <w:rPr>
+                <w:rFonts w:ascii="Calibri" w:hAnsi="Calibri"/>
+                <w:b w:val="0"/>
+                <w:sz w:val="17"/>
+              </w:rPr>
+              <w:t>2.69</w:t>
+            </w:r>
+          </w:p>
+        </w:tc>
+        <w:tc>
+          <w:tcPr>
+            <w:tcW w:type="dxa" w:w="1560"/>
+            <w:shd w:val="clear" w:color="auto" w:fill="FFFFFF"/>
+            <w:vAlign w:val="center"/>
+          </w:tcPr>
+          <w:p>
+            <w:pPr>
+              <w:jc w:val="center"/>
+            </w:pPr>
+            <w:r>
+              <w:rPr>
+                <w:rFonts w:ascii="Calibri" w:hAnsi="Calibri"/>
+                <w:b w:val="0"/>
+                <w:sz w:val="17"/>
+              </w:rPr>
+              <w:t>4.83</w:t>
+            </w:r>
+          </w:p>
+        </w:tc>
+      </w:tr>
+      <w:tr>
+        <w:tc>
+          <w:tcPr>
+            <w:tcW w:type="dxa" w:w="1560"/>
+            <w:shd w:val="clear" w:color="auto" w:fill="EFF6F7"/>
+            <w:vAlign w:val="center"/>
+          </w:tcPr>
+          <w:p>
+            <w:pPr>
+              <w:jc w:val="left"/>
+            </w:pPr>
+            <w:r>
+              <w:rPr>
+                <w:rFonts w:ascii="Calibri" w:hAnsi="Calibri"/>
+                <w:b w:val="0"/>
+                <w:sz w:val="17"/>
+              </w:rPr>
+              <w:t>D with recency 240 d</w:t>
+            </w:r>
+          </w:p>
+        </w:tc>
+        <w:tc>
+          <w:tcPr>
+            <w:tcW w:type="dxa" w:w="1560"/>
+            <w:shd w:val="clear" w:color="auto" w:fill="EFF6F7"/>
+            <w:vAlign w:val="center"/>
+          </w:tcPr>
+          <w:p>
+            <w:pPr>
+              <w:jc w:val="center"/>
+            </w:pPr>
+            <w:r>
+              <w:rPr>
+                <w:rFonts w:ascii="Calibri" w:hAnsi="Calibri"/>
+                <w:b w:val="0"/>
+                <w:sz w:val="17"/>
+              </w:rPr>
+              <w:t>3.20</w:t>
+            </w:r>
+          </w:p>
+        </w:tc>
+        <w:tc>
+          <w:tcPr>
+            <w:tcW w:type="dxa" w:w="1560"/>
+            <w:shd w:val="clear" w:color="auto" w:fill="EFF6F7"/>
+            <w:vAlign w:val="center"/>
+          </w:tcPr>
+          <w:p>
+            <w:pPr>
+              <w:jc w:val="center"/>
+            </w:pPr>
+            <w:r>
+              <w:rPr>
+                <w:rFonts w:ascii="Calibri" w:hAnsi="Calibri"/>
+                <w:b w:val="0"/>
+                <w:sz w:val="17"/>
+              </w:rPr>
+              <w:t>2.90</w:t>
+            </w:r>
+          </w:p>
+        </w:tc>
+        <w:tc>
+          <w:tcPr>
+            <w:tcW w:type="dxa" w:w="1560"/>
+            <w:shd w:val="clear" w:color="auto" w:fill="EFF6F7"/>
+            <w:vAlign w:val="center"/>
+          </w:tcPr>
+          <w:p>
+            <w:pPr>
+              <w:jc w:val="center"/>
+            </w:pPr>
+            <w:r>
+              <w:rPr>
+                <w:rFonts w:ascii="Calibri" w:hAnsi="Calibri"/>
+                <w:b w:val="0"/>
+                <w:sz w:val="17"/>
+              </w:rPr>
+              <w:t>2.10</w:t>
+            </w:r>
+          </w:p>
+        </w:tc>
+        <w:tc>
+          <w:tcPr>
+            <w:tcW w:type="dxa" w:w="1560"/>
+            <w:shd w:val="clear" w:color="auto" w:fill="EFF6F7"/>
+            <w:vAlign w:val="center"/>
+          </w:tcPr>
+          <w:p>
+            <w:pPr>
+              <w:jc w:val="center"/>
+            </w:pPr>
+            <w:r>
+              <w:rPr>
+                <w:rFonts w:ascii="Calibri" w:hAnsi="Calibri"/>
+                <w:b w:val="0"/>
+                <w:sz w:val="17"/>
+              </w:rPr>
+              <w:t>2.73</w:t>
+            </w:r>
+          </w:p>
+        </w:tc>
+        <w:tc>
+          <w:tcPr>
+            <w:tcW w:type="dxa" w:w="1560"/>
+            <w:shd w:val="clear" w:color="auto" w:fill="EFF6F7"/>
+            <w:vAlign w:val="center"/>
+          </w:tcPr>
+          <w:p>
+            <w:pPr>
+              <w:jc w:val="center"/>
+            </w:pPr>
+            <w:r>
+              <w:rPr>
+                <w:rFonts w:ascii="Calibri" w:hAnsi="Calibri"/>
+                <w:b w:val="0"/>
+                <w:sz w:val="17"/>
+              </w:rPr>
+              <w:t>4.88</w:t>
             </w:r>
           </w:p>
         </w:tc>
@@ -3235,6 +4395,19 @@
       <w:pPr>
         <w:spacing w:after="40"/>
       </w:pPr>
+    </w:p>
+    <w:p>
+      <w:pPr>
+        <w:spacing w:after="40"/>
+      </w:pPr>
+      <w:r>
+        <w:rPr>
+          <w:rFonts w:ascii="Calibri" w:hAnsi="Calibri"/>
+          <w:color w:val="444444"/>
+          <w:sz w:val="20"/>
+        </w:rPr>
+        <w:t>Caveat: the recency constant and the feature set were chosen using these same three folds, so the final figure is somewhat optimistic. Adding the market features and day_index alone helps in folds 2–3 but not fold 1; the full final configuration beats the original in all three folds. The model still under-predicts (mean signed error -0.5%, -0.7%, -1.5% in folds 1–3, non-outlier rows).</w:t>
+      </w:r>
     </w:p>
     <w:p>
       <w:pPr>
@@ -3270,7 +4443,7 @@
           <w:color w:val="444444"/>
           <w:sz w:val="20"/>
         </w:rPr>
-        <w:t>The data/december_chart_inputs.csv file does not include these columns. Both are filled with their per-date median from data/validation.csv inputs for December 2025 (market_index median per day from the 6,030 non-missing December validation rows; quote_signal median per day from all 6,164 December validation rows). Lexington coordinates (36.99152, −84.99876) and Fort Wayne coordinates (41.31561, −85.36206) are taken from data/train_test.csv. Predictions range $785.49–$803.38 (mean $795.59), a swing of about $18 (2%). The curve repeats weekly: the weekday means are highest on Thursday ($801.9) and lowest on Sunday ($789.8).</w:t>
+        <w:t>The data/december_chart_inputs.csv file does not include these columns. Both are filled with their per-date median from data/validation.csv inputs for December 2025 (market_index median per day from the 6,030 non-missing December validation rows; quote_signal median per day from all 6,164 December validation rows). Lexington coordinates (36.99152, −84.99876) and Fort Wayne coordinates (41.31561, −85.36206) are taken from data/train_test.csv. Predictions range $812.76–$828.41 (mean $821.07), a swing of about $16 (2%). By weekday the means are highest on Thursday ($826.1) and lowest on Sunday ($815.3).</w:t>
       </w:r>
     </w:p>
     <w:p>
@@ -3455,7 +4628,35 @@
           <w:color w:val="1A8A9E"/>
           <w:sz w:val="17"/>
         </w:rPr>
-        <w:t># 4. (Optional) Regenerate this report</w:t>
+        <w:t># 4. (Optional) Re-run the feature ablation (Section 5)</w:t>
+      </w:r>
+    </w:p>
+    <w:p>
+      <w:pPr>
+        <w:spacing w:before="0" w:after="20"/>
+        <w:ind w:left="288"/>
+      </w:pPr>
+      <w:r>
+        <w:rPr>
+          <w:rFonts w:ascii="Courier New" w:hAnsi="Courier New"/>
+          <w:color w:val="1C2C30"/>
+          <w:sz w:val="17"/>
+        </w:rPr>
+        <w:t>python src/ablation.py</w:t>
+      </w:r>
+    </w:p>
+    <w:p>
+      <w:pPr>
+        <w:spacing w:before="80" w:after="0"/>
+      </w:pPr>
+      <w:r>
+        <w:rPr>
+          <w:rFonts w:ascii="Courier New" w:hAnsi="Courier New"/>
+          <w:i/>
+          <w:color w:val="1A8A9E"/>
+          <w:sz w:val="17"/>
+        </w:rPr>
+        <w:t># 5. (Optional) Regenerate this report</w:t>
       </w:r>
     </w:p>
     <w:p>

</xml_diff>